<commit_message>
Improve hatchback analysis with manufacturer counts and summary statistics
</commit_message>
<xml_diff>
--- a/EDA_Report_Automobiles.docx
+++ b/EDA_Report_Automobiles.docx
@@ -126,61 +126,28 @@
     </w:p>
     <w:p>
       <w:pPr>
-        <w:spacing w:after="480" w:line="360" w:lineRule="auto"/>
-        <w:jc w:val="both"/>
-        <w:rPr>
-          <w:color w:val="888888"/>
-        </w:rPr>
-      </w:pPr>
-      <w:r>
-        <w:rPr>
-          <w:rFonts w:ascii="Calibri" w:hAnsi="Calibri" w:cs="Calibri"/>
-        </w:rPr>
-        <w:t>The Palmer Penguins dataset contains physical measurements for 344 penguins collected at Palmer Station, Antarctica. Three species are represented</w:t>
-      </w:r>
-      <w:r>
-        <w:rPr>
-          <w:rFonts w:ascii="Calibri" w:hAnsi="Calibri" w:cs="Calibri"/>
-        </w:rPr>
-        <w:t>:</w:t>
-      </w:r>
-      <w:r>
-        <w:rPr>
-          <w:rFonts w:ascii="Calibri" w:hAnsi="Calibri" w:cs="Calibri"/>
-        </w:rPr>
-        <w:t xml:space="preserve"> Adelie, Chinstrap, and Gentoo</w:t>
-      </w:r>
-      <w:r>
-        <w:rPr>
-          <w:rFonts w:ascii="Calibri" w:hAnsi="Calibri" w:cs="Calibri"/>
-        </w:rPr>
-        <w:t>.</w:t>
-      </w:r>
-      <w:r>
-        <w:rPr>
-          <w:rFonts w:ascii="Calibri" w:hAnsi="Calibri" w:cs="Calibri"/>
-        </w:rPr>
-        <w:t xml:space="preserve"> </w:t>
-      </w:r>
-      <w:r>
-        <w:rPr>
-          <w:rFonts w:ascii="Calibri" w:hAnsi="Calibri" w:cs="Calibri"/>
-        </w:rPr>
-        <w:t>These penguins were observed</w:t>
-      </w:r>
-      <w:r>
-        <w:rPr>
-          <w:rFonts w:ascii="Calibri" w:hAnsi="Calibri" w:cs="Calibri"/>
-        </w:rPr>
-        <w:t xml:space="preserve"> across three islands in the Palmer Archipelago. The dataset includes seven variables: species, island, culmen length, culmen depth, flipper length, body mass, and sex</w:t>
-      </w:r>
-      <w:r>
-        <w:rPr>
-          <w:i/>
-          <w:iCs/>
-          <w:color w:val="888888"/>
-        </w:rPr>
-        <w:t>.</w:t>
+        <w:spacing w:line="360" w:lineRule="auto"/>
+        <w:rPr>
+          <w:b/>
+          <w:bCs/>
+        </w:rPr>
+      </w:pPr>
+      <w:r>
+        <w:t xml:space="preserve">The automobile dataset covers </w:t>
+      </w:r>
+      <w:proofErr w:type="gramStart"/>
+      <w:r>
+        <w:t>a large number of</w:t>
+      </w:r>
+      <w:proofErr w:type="gramEnd"/>
+      <w:r>
+        <w:t xml:space="preserve"> cars across </w:t>
+      </w:r>
+      <w:r>
+        <w:t>multiple</w:t>
+      </w:r>
+      <w:r>
+        <w:t xml:space="preserve"> variables, including make, price, engine size, horsepower, and fuel economy figures. The dataset was sourced as a text file and required cleaning before any meaningful analysis could be done.</w:t>
       </w:r>
     </w:p>
     <w:p>
@@ -203,7 +170,153 @@
         <w:rPr>
           <w:rFonts w:ascii="Calibri" w:hAnsi="Calibri" w:cs="Calibri"/>
         </w:rPr>
-        <w:t>The dataset was inspected for structure, data types, and completeness. Column names were consistent and no duplicate rows were found. Two rows were missing all physical measurements and were removed, reducing the dataset to 342 rows. Ten rows had no sex recorded but retained complete physical measurements and were kept for analysis.</w:t>
+        <w:t>Two columns were dropped upfront</w:t>
+      </w:r>
+      <w:r>
+        <w:rPr>
+          <w:rFonts w:ascii="Calibri" w:hAnsi="Calibri" w:cs="Calibri"/>
+        </w:rPr>
+        <w:t>,</w:t>
+      </w:r>
+      <w:r>
+        <w:rPr>
+          <w:rFonts w:ascii="Calibri" w:hAnsi="Calibri" w:cs="Calibri"/>
+        </w:rPr>
+        <w:t xml:space="preserve"> </w:t>
+      </w:r>
+      <w:proofErr w:type="spellStart"/>
+      <w:r>
+        <w:rPr>
+          <w:rFonts w:ascii="Calibri" w:hAnsi="Calibri" w:cs="Calibri"/>
+        </w:rPr>
+        <w:t>symboling</w:t>
+      </w:r>
+      <w:proofErr w:type="spellEnd"/>
+      <w:r>
+        <w:rPr>
+          <w:rFonts w:ascii="Calibri" w:hAnsi="Calibri" w:cs="Calibri"/>
+        </w:rPr>
+        <w:t xml:space="preserve"> and </w:t>
+      </w:r>
+      <w:proofErr w:type="gramStart"/>
+      <w:r>
+        <w:rPr>
+          <w:rFonts w:ascii="Calibri" w:hAnsi="Calibri" w:cs="Calibri"/>
+        </w:rPr>
+        <w:t>normalized-losses</w:t>
+      </w:r>
+      <w:proofErr w:type="gramEnd"/>
+      <w:r>
+        <w:rPr>
+          <w:rFonts w:ascii="Calibri" w:hAnsi="Calibri" w:cs="Calibri"/>
+        </w:rPr>
+        <w:t>,</w:t>
+      </w:r>
+      <w:r>
+        <w:rPr>
+          <w:rFonts w:ascii="Calibri" w:hAnsi="Calibri" w:cs="Calibri"/>
+        </w:rPr>
+        <w:t xml:space="preserve"> as neither was relevant to the questions being investigated. The data was checked for duplicates; none were found. </w:t>
+      </w:r>
+    </w:p>
+    <w:p>
+      <w:pPr>
+        <w:spacing w:line="360" w:lineRule="auto"/>
+        <w:jc w:val="both"/>
+        <w:rPr>
+          <w:rFonts w:ascii="Calibri" w:hAnsi="Calibri" w:cs="Calibri"/>
+        </w:rPr>
+      </w:pPr>
+    </w:p>
+    <w:p>
+      <w:pPr>
+        <w:spacing w:line="360" w:lineRule="auto"/>
+        <w:jc w:val="both"/>
+        <w:rPr>
+          <w:rFonts w:ascii="Calibri" w:hAnsi="Calibri" w:cs="Calibri"/>
+        </w:rPr>
+      </w:pPr>
+      <w:r>
+        <w:rPr>
+          <w:rFonts w:ascii="Calibri" w:hAnsi="Calibri" w:cs="Calibri"/>
+        </w:rPr>
+        <w:t xml:space="preserve">Missing values were not stored as blanks. Instead, they appeared as '?' characters, which pandas read as valid text. These were replaced with </w:t>
+      </w:r>
+      <w:r>
+        <w:rPr>
+          <w:rFonts w:ascii="Calibri" w:hAnsi="Calibri" w:cs="Calibri"/>
+        </w:rPr>
+        <w:t>‘</w:t>
+      </w:r>
+      <w:proofErr w:type="spellStart"/>
+      <w:r>
+        <w:rPr>
+          <w:rFonts w:ascii="Calibri" w:hAnsi="Calibri" w:cs="Calibri"/>
+        </w:rPr>
+        <w:t>NaN</w:t>
+      </w:r>
+      <w:proofErr w:type="spellEnd"/>
+      <w:r>
+        <w:rPr>
+          <w:rFonts w:ascii="Calibri" w:hAnsi="Calibri" w:cs="Calibri"/>
+        </w:rPr>
+        <w:t>’</w:t>
+      </w:r>
+      <w:r>
+        <w:rPr>
+          <w:rFonts w:ascii="Calibri" w:hAnsi="Calibri" w:cs="Calibri"/>
+        </w:rPr>
+        <w:t xml:space="preserve"> before any rows with missing data were removed. Six columns were affected: </w:t>
+      </w:r>
+      <w:proofErr w:type="spellStart"/>
+      <w:r>
+        <w:rPr>
+          <w:rFonts w:ascii="Calibri" w:hAnsi="Calibri" w:cs="Calibri"/>
+        </w:rPr>
+        <w:t>num</w:t>
+      </w:r>
+      <w:proofErr w:type="spellEnd"/>
+      <w:r>
+        <w:rPr>
+          <w:rFonts w:ascii="Calibri" w:hAnsi="Calibri" w:cs="Calibri"/>
+        </w:rPr>
+        <w:t xml:space="preserve">-of-doors, bore, stroke, horsepower, peak-rpm, and price. Dropping those rows brought the dataset down from 205 to 193. </w:t>
+      </w:r>
+    </w:p>
+    <w:p>
+      <w:pPr>
+        <w:spacing w:line="360" w:lineRule="auto"/>
+        <w:jc w:val="both"/>
+        <w:rPr>
+          <w:rFonts w:ascii="Calibri" w:hAnsi="Calibri" w:cs="Calibri"/>
+        </w:rPr>
+      </w:pPr>
+    </w:p>
+    <w:p>
+      <w:pPr>
+        <w:spacing w:line="360" w:lineRule="auto"/>
+        <w:jc w:val="both"/>
+        <w:rPr>
+          <w:rFonts w:ascii="Calibri" w:hAnsi="Calibri" w:cs="Calibri"/>
+        </w:rPr>
+      </w:pPr>
+      <w:r>
+        <w:rPr>
+          <w:rFonts w:ascii="Calibri" w:hAnsi="Calibri" w:cs="Calibri"/>
+        </w:rPr>
+        <w:t>Several columns that should have been numeric were stored as text, a side effect of the '?' issue. These were converted</w:t>
+      </w:r>
+      <w:r>
+        <w:rPr>
+          <w:rFonts w:ascii="Calibri" w:hAnsi="Calibri" w:cs="Calibri"/>
+        </w:rPr>
+        <w:t>:</w:t>
+      </w:r>
+      <w:r>
+        <w:rPr>
+          <w:rFonts w:ascii="Calibri" w:hAnsi="Calibri" w:cs="Calibri"/>
+        </w:rPr>
+        <w:t xml:space="preserve"> whole number columns to int64 and decimal columns to float64.</w:t>
       </w:r>
     </w:p>
     <w:p>
@@ -233,6 +346,7 @@
         <w:rPr>
           <w:rFonts w:ascii="Calibri" w:hAnsi="Calibri" w:cs="Calibri"/>
         </w:rPr>
+        <w:lastRenderedPageBreak/>
         <w:t>The dataset had two types of missing data. Two rows had no physical measurements recorded at all. These were dropped as they could not contribute to any part of the analysis. The sex column was missing values for 10 rows, but all 10 had complete physical measurements. These rows were kept since sex was not a focus of this analysis.</w:t>
       </w:r>
     </w:p>
@@ -1791,7 +1905,6 @@
   <w:style w:type="character" w:default="1" w:styleId="DefaultParagraphFont">
     <w:name w:val="Default Paragraph Font"/>
     <w:uiPriority w:val="1"/>
-    <w:semiHidden/>
     <w:unhideWhenUsed/>
   </w:style>
   <w:style w:type="table" w:default="1" w:styleId="TableNormal">

</xml_diff>